<commit_message>
Remove title pages and unnecessary page breaks from all documents
- Removed 30 page breaks across all documents (uitleg, begeleide inoefening,
  nieuws met visual files) so content flows continuously without forced pages
- Removed leading empty paragraphs that created title page whitespace
- Compacted title area spacing so titles flow directly into content
- Cleaned up consecutive empty paragraphs created by break removal

https://claude.ai/code/session_01NC7ETFqUooirTCpjhGMGE5
</commit_message>
<xml_diff>
--- a/Opgave 1 Zorgverzekering/Opgave 1 Zorgverzekering – nieuws met visual.docx
+++ b/Opgave 1 Zorgverzekering/Opgave 1 Zorgverzekering – nieuws met visual.docx
@@ -244,11 +244,7 @@
         <w:t xml:space="preserve">De overheid overweegt het eigen risico te verlagen. Bedenk een economisch argument vóór en tégen deze maatregel.</w:t>
       </w:r>
     </w:p>
-    <w:p>
-      <w:r>
-        <w:br w:type="page"/>
-      </w:r>
-    </w:p>
+    <w:p/>
     <w:p>
       <w:pPr>
         <w:spacing w:after="100"/>

</xml_diff>